<commit_message>
Petra hospital study: owner is a physician, not an orthopaedic surgeon
Adds a condition and risk on contracting resident surgeons; financials unchanged.

Co-Authored-By: Claude Opus 5.5 (1M context) <noreply@anthropic.com>
Claude-Session: https://claude.ai/code/session_01KaqwEyPcNCAyBboHzfJGfv
</commit_message>
<xml_diff>
--- a/feasibility-study-team-of-agents/studies/petra-trauma-hospital/feasibility-study.docx
+++ b/feasibility-study-team-of-agents/studies/petra-trauma-hospital/feasibility-study.docx
@@ -1573,6 +1573,22 @@
     </w:p>
     <w:p>
       <w:pPr>
+        <w:numPr>
+          <w:ilvl w:val="0"/>
+          <w:numId w:val="1003"/>
+        </w:numPr>
+        <w:pStyle w:val="Compact"/>
+        <w:bidi/>
+      </w:pPr>
+      <w:r>
+        <w:rPr>
+          <w:rtl/>
+        </w:rPr>
+        <w:t xml:space="preserve">Resident orthopaedic and general surgeons are contracted before financing closes. The owner is a physician, not a surgeon, so the surgical volume depends on them.</w:t>
+      </w:r>
+    </w:p>
+    <w:p>
+      <w:pPr>
         <w:bidi/>
       </w:pPr>
       <w:r>
@@ -2826,6 +2842,22 @@
           <w:rtl/>
         </w:rPr>
         <w:t xml:space="preserve">قرار الإعفاءات الاستثمارية، وعرض بنكي ضمن برنامج البنك المركزي.</w:t>
+      </w:r>
+    </w:p>
+    <w:p>
+      <w:pPr>
+        <w:numPr>
+          <w:ilvl w:val="0"/>
+          <w:numId w:val="1008"/>
+        </w:numPr>
+        <w:pStyle w:val="Compact"/>
+        <w:bidi/>
+      </w:pPr>
+      <w:r>
+        <w:rPr>
+          <w:rtl/>
+        </w:rPr>
+        <w:t xml:space="preserve">التعاقد المسبق مع جرّاح عظام وجرّاح عام مقيمَين قبل إغلاق التمويل، لأن المالك طبيب غير جرّاح وحجم العمليات يعتمد عليهما.</w:t>
       </w:r>
     </w:p>
     <w:p>
@@ -6280,7 +6312,7 @@
         <w:rPr>
           <w:rtl/>
         </w:rPr>
-        <w:t xml:space="preserve">جرّاح عظام مالك ومقيم في المنطقة.</w:t>
+        <w:t xml:space="preserve">مالك ومدير طبي مقيم في المنطقة.</w:t>
       </w:r>
     </w:p>
     <w:p>
@@ -21154,7 +21186,7 @@
               <w:rPr>
                 <w:rtl/>
               </w:rPr>
-              <w:t xml:space="preserve">صعوبة استقطاب الأخصائيين، ورواتب أعلى</w:t>
+              <w:t xml:space="preserve">صعوبة استقطاب الأخصائيين، ولا سيما جرّاح عظام مقيم لأن المالك طبيب غير جرّاح، ورواتب أعلى</w:t>
             </w:r>
           </w:p>
         </w:tc>
@@ -22635,7 +22667,7 @@
         <w:rPr>
           <w:rtl/>
         </w:rPr>
-        <w:t xml:space="preserve">كم عدد عملياتك الحالية سنوياً، وأين تجريها؟</w:t>
+        <w:t xml:space="preserve">ما تخصصك وخبرتك الإدارية؟ وهل لديك جرّاحون (عظام، عامة، نسائية) مستعدون للعمل أو الشراكة؟ كم عملية يجرون سنوياً، وأين؟</w:t>
       </w:r>
     </w:p>
     <w:p>

</xml_diff>